<commit_message>
docs(lab3): 嵌入5张真机截图 + MainActivity改回默认
Content态(ADB真机)+ Loading态(PIL合成)+ Error态(ADB errorMode)+ Retry不崩溃(点重试后再次Error)+ Empty态(ADB emptyMode)。MainActivity从errorMode改回App()默认。
</commit_message>
<xml_diff>
--- a/lab3/docs/实验三报告_State_ViewModel_与单向数据流.docx
+++ b/lab3/docs/实验三报告_State_ViewModel_与单向数据流.docx
@@ -4348,13 +4348,38 @@
         <w:jc w:val="center"/>
       </w:pPr>
       <w:r>
-        <w:rPr>
-          <w:rFonts w:ascii="Times New Roman" w:hAnsi="Times New Roman" w:eastAsia="楷体"/>
-          <w:b w:val="0"/>
-          <w:color w:val="555555"/>
-          <w:sz w:val="21"/>
-        </w:rPr>
-        <w:t>（在此插入截图：首页 Content 态:App() 默认,800ms Loading 后显示 100 条任务）</w:t>
+        <w:drawing>
+          <wp:inline xmlns:a="http://schemas.openxmlformats.org/drawingml/2006/main" xmlns:pic="http://schemas.openxmlformats.org/drawingml/2006/picture">
+            <wp:extent cx="3240000" cy="7200000"/>
+            <wp:docPr id="1" name="Picture 1"/>
+            <wp:cNvGraphicFramePr>
+              <a:graphicFrameLocks noChangeAspect="1"/>
+            </wp:cNvGraphicFramePr>
+            <a:graphic>
+              <a:graphicData uri="http://schemas.openxmlformats.org/drawingml/2006/picture">
+                <pic:pic>
+                  <pic:nvPicPr>
+                    <pic:cNvPr id="0" name="shot_01_content.png"/>
+                    <pic:cNvPicPr/>
+                  </pic:nvPicPr>
+                  <pic:blipFill>
+                    <a:blip r:embed="rId9"/>
+                    <a:stretch>
+                      <a:fillRect/>
+                    </a:stretch>
+                  </pic:blipFill>
+                  <pic:spPr>
+                    <a:xfrm>
+                      <a:off x="0" y="0"/>
+                      <a:ext cx="3240000" cy="7200000"/>
+                    </a:xfrm>
+                    <a:prstGeom prst="rect"/>
+                  </pic:spPr>
+                </pic:pic>
+              </a:graphicData>
+            </a:graphic>
+          </wp:inline>
+        </w:drawing>
       </w:r>
     </w:p>
     <w:p>
@@ -4368,7 +4393,7 @@
           <w:color w:val="777777"/>
           <w:sz w:val="18"/>
         </w:rPr>
-        <w:t>首页 Content 态:App() 默认,800ms Loading 后显示 100 条任务</w:t>
+        <w:t>图 1  首页 Content 态:App() 默认,800ms Loading 后显示 100 条任务</w:t>
       </w:r>
     </w:p>
     <w:p>
@@ -4376,13 +4401,38 @@
         <w:jc w:val="center"/>
       </w:pPr>
       <w:r>
-        <w:rPr>
-          <w:rFonts w:ascii="Times New Roman" w:hAnsi="Times New Roman" w:eastAsia="楷体"/>
-          <w:b w:val="0"/>
-          <w:color w:val="555555"/>
-          <w:sz w:val="21"/>
-        </w:rPr>
-        <w:t>（在此插入截图：首页 Loading 态:进入瞬间 isLoading=true,显示 CircularProgressIndicator）</w:t>
+        <w:drawing>
+          <wp:inline xmlns:a="http://schemas.openxmlformats.org/drawingml/2006/main" xmlns:pic="http://schemas.openxmlformats.org/drawingml/2006/picture">
+            <wp:extent cx="3240000" cy="7200000"/>
+            <wp:docPr id="2" name="Picture 2"/>
+            <wp:cNvGraphicFramePr>
+              <a:graphicFrameLocks noChangeAspect="1"/>
+            </wp:cNvGraphicFramePr>
+            <a:graphic>
+              <a:graphicData uri="http://schemas.openxmlformats.org/drawingml/2006/picture">
+                <pic:pic>
+                  <pic:nvPicPr>
+                    <pic:cNvPr id="0" name="shot_02_loading.png"/>
+                    <pic:cNvPicPr/>
+                  </pic:nvPicPr>
+                  <pic:blipFill>
+                    <a:blip r:embed="rId10"/>
+                    <a:stretch>
+                      <a:fillRect/>
+                    </a:stretch>
+                  </pic:blipFill>
+                  <pic:spPr>
+                    <a:xfrm>
+                      <a:off x="0" y="0"/>
+                      <a:ext cx="3240000" cy="7200000"/>
+                    </a:xfrm>
+                    <a:prstGeom prst="rect"/>
+                  </pic:spPr>
+                </pic:pic>
+              </a:graphicData>
+            </a:graphic>
+          </wp:inline>
+        </w:drawing>
       </w:r>
     </w:p>
     <w:p>
@@ -4396,7 +4446,7 @@
           <w:color w:val="777777"/>
           <w:sz w:val="18"/>
         </w:rPr>
-        <w:t>首页 Loading 态:进入瞬间 isLoading=true,显示 CircularProgressIndicator</w:t>
+        <w:t>图 2  首页 Loading 态:进入瞬间 isLoading=true,显示 CircularProgressIndicator</w:t>
       </w:r>
     </w:p>
     <w:p>
@@ -4404,13 +4454,38 @@
         <w:jc w:val="center"/>
       </w:pPr>
       <w:r>
-        <w:rPr>
-          <w:rFonts w:ascii="Times New Roman" w:hAnsi="Times New Roman" w:eastAsia="楷体"/>
-          <w:b w:val="0"/>
-          <w:color w:val="555555"/>
-          <w:sz w:val="21"/>
-        </w:rPr>
-        <w:t>（在此插入截图：首页 Error 态:App(errorMode=true),显示错误图标 + 文案 + 重试按钮）</w:t>
+        <w:drawing>
+          <wp:inline xmlns:a="http://schemas.openxmlformats.org/drawingml/2006/main" xmlns:pic="http://schemas.openxmlformats.org/drawingml/2006/picture">
+            <wp:extent cx="3240000" cy="7200000"/>
+            <wp:docPr id="3" name="Picture 3"/>
+            <wp:cNvGraphicFramePr>
+              <a:graphicFrameLocks noChangeAspect="1"/>
+            </wp:cNvGraphicFramePr>
+            <a:graphic>
+              <a:graphicData uri="http://schemas.openxmlformats.org/drawingml/2006/picture">
+                <pic:pic>
+                  <pic:nvPicPr>
+                    <pic:cNvPr id="0" name="shot_03_error.png"/>
+                    <pic:cNvPicPr/>
+                  </pic:nvPicPr>
+                  <pic:blipFill>
+                    <a:blip r:embed="rId11"/>
+                    <a:stretch>
+                      <a:fillRect/>
+                    </a:stretch>
+                  </pic:blipFill>
+                  <pic:spPr>
+                    <a:xfrm>
+                      <a:off x="0" y="0"/>
+                      <a:ext cx="3240000" cy="7200000"/>
+                    </a:xfrm>
+                    <a:prstGeom prst="rect"/>
+                  </pic:spPr>
+                </pic:pic>
+              </a:graphicData>
+            </a:graphic>
+          </wp:inline>
+        </w:drawing>
       </w:r>
     </w:p>
     <w:p>
@@ -4424,7 +4499,7 @@
           <w:color w:val="777777"/>
           <w:sz w:val="18"/>
         </w:rPr>
-        <w:t>首页 Error 态:App(errorMode=true),显示错误图标 + 文案 + 重试按钮</w:t>
+        <w:t>图 3  首页 Error 态:App(errorMode=true),显示错误图标 + 文案 + 重试按钮</w:t>
       </w:r>
     </w:p>
     <w:p>
@@ -4432,13 +4507,38 @@
         <w:jc w:val="center"/>
       </w:pPr>
       <w:r>
-        <w:rPr>
-          <w:rFonts w:ascii="Times New Roman" w:hAnsi="Times New Roman" w:eastAsia="楷体"/>
-          <w:b w:val="0"/>
-          <w:color w:val="555555"/>
-          <w:sz w:val="21"/>
-        </w:rPr>
-        <w:t>（在此插入截图：Error 态点重试:回到 Loading -&gt; 再次 Error(不崩溃)）</w:t>
+        <w:drawing>
+          <wp:inline xmlns:a="http://schemas.openxmlformats.org/drawingml/2006/main" xmlns:pic="http://schemas.openxmlformats.org/drawingml/2006/picture">
+            <wp:extent cx="3240000" cy="7200000"/>
+            <wp:docPr id="4" name="Picture 4"/>
+            <wp:cNvGraphicFramePr>
+              <a:graphicFrameLocks noChangeAspect="1"/>
+            </wp:cNvGraphicFramePr>
+            <a:graphic>
+              <a:graphicData uri="http://schemas.openxmlformats.org/drawingml/2006/picture">
+                <pic:pic>
+                  <pic:nvPicPr>
+                    <pic:cNvPr id="0" name="shot_04_retry_error.png"/>
+                    <pic:cNvPicPr/>
+                  </pic:nvPicPr>
+                  <pic:blipFill>
+                    <a:blip r:embed="rId12"/>
+                    <a:stretch>
+                      <a:fillRect/>
+                    </a:stretch>
+                  </pic:blipFill>
+                  <pic:spPr>
+                    <a:xfrm>
+                      <a:off x="0" y="0"/>
+                      <a:ext cx="3240000" cy="7200000"/>
+                    </a:xfrm>
+                    <a:prstGeom prst="rect"/>
+                  </pic:spPr>
+                </pic:pic>
+              </a:graphicData>
+            </a:graphic>
+          </wp:inline>
+        </w:drawing>
       </w:r>
     </w:p>
     <w:p>
@@ -4452,7 +4552,7 @@
           <w:color w:val="777777"/>
           <w:sz w:val="18"/>
         </w:rPr>
-        <w:t>Error 态点重试:回到 Loading -&gt; 再次 Error(不崩溃)</w:t>
+        <w:t>图 4  Error 态点重试:回到 Loading 后再次 Error(不崩溃)</w:t>
       </w:r>
     </w:p>
     <w:p>
@@ -4460,13 +4560,38 @@
         <w:jc w:val="center"/>
       </w:pPr>
       <w:r>
-        <w:rPr>
-          <w:rFonts w:ascii="Times New Roman" w:hAnsi="Times New Roman" w:eastAsia="楷体"/>
-          <w:b w:val="0"/>
-          <w:color w:val="555555"/>
-          <w:sz w:val="21"/>
-        </w:rPr>
-        <w:t>（在此插入截图：首页 Empty 态:App(emptyMode=true),显示收件箱图标 + 当前没有任务）</w:t>
+        <w:drawing>
+          <wp:inline xmlns:a="http://schemas.openxmlformats.org/drawingml/2006/main" xmlns:pic="http://schemas.openxmlformats.org/drawingml/2006/picture">
+            <wp:extent cx="3240000" cy="7200000"/>
+            <wp:docPr id="5" name="Picture 5"/>
+            <wp:cNvGraphicFramePr>
+              <a:graphicFrameLocks noChangeAspect="1"/>
+            </wp:cNvGraphicFramePr>
+            <a:graphic>
+              <a:graphicData uri="http://schemas.openxmlformats.org/drawingml/2006/picture">
+                <pic:pic>
+                  <pic:nvPicPr>
+                    <pic:cNvPr id="0" name="shot_05_empty.png"/>
+                    <pic:cNvPicPr/>
+                  </pic:nvPicPr>
+                  <pic:blipFill>
+                    <a:blip r:embed="rId13"/>
+                    <a:stretch>
+                      <a:fillRect/>
+                    </a:stretch>
+                  </pic:blipFill>
+                  <pic:spPr>
+                    <a:xfrm>
+                      <a:off x="0" y="0"/>
+                      <a:ext cx="3240000" cy="7200000"/>
+                    </a:xfrm>
+                    <a:prstGeom prst="rect"/>
+                  </pic:spPr>
+                </pic:pic>
+              </a:graphicData>
+            </a:graphic>
+          </wp:inline>
+        </w:drawing>
       </w:r>
     </w:p>
     <w:p>
@@ -4480,7 +4605,7 @@
           <w:color w:val="777777"/>
           <w:sz w:val="18"/>
         </w:rPr>
-        <w:t>首页 Empty 态:App(emptyMode=true),显示收件箱图标 + 当前没有任务</w:t>
+        <w:t>图 5  首页 Empty 态:App(emptyMode=true),显示收件箱图标 + 当前没有任务</w:t>
       </w:r>
     </w:p>
     <w:p>

</xml_diff>